<commit_message>
Added high lift devices
</commit_message>
<xml_diff>
--- a/+Unconventional/+LandingGear/Key values Landing gear.docx
+++ b/+Unconventional/+LandingGear/Key values Landing gear.docx
@@ -51,15 +51,7 @@
         </w:numPr>
       </w:pPr>
       <w:r>
-        <w:t xml:space="preserve">Centre of </w:t>
-      </w:r>
-      <w:proofErr w:type="gramStart"/>
-      <w:r>
-        <w:t>gravity height</w:t>
-      </w:r>
-      <w:proofErr w:type="gramEnd"/>
-      <w:r>
-        <w:t xml:space="preserve"> =</w:t>
+        <w:t>Centre of gravity height =</w:t>
       </w:r>
       <w:r>
         <w:t xml:space="preserve"> 3.15m</w:t>
@@ -376,15 +368,7 @@
         <w:br/>
       </w:r>
       <w:r>
-        <w:t xml:space="preserve">     6. Landing gear mass estimate </w:t>
-      </w:r>
-      <w:proofErr w:type="gramStart"/>
-      <w:r>
-        <w:t>( Raymers</w:t>
-      </w:r>
-      <w:proofErr w:type="gramEnd"/>
-      <w:r>
-        <w:t>)</w:t>
+        <w:t xml:space="preserve">     6. Landing gear mass estimate ( Raymers)</w:t>
       </w:r>
     </w:p>
     <w:p>
@@ -583,23 +567,7 @@
       </w:r>
       <w:r>
         <w:br/>
-        <w:t xml:space="preserve">Nose gear should </w:t>
-      </w:r>
-      <w:proofErr w:type="gramStart"/>
-      <w:r>
-        <w:t>5%</w:t>
-      </w:r>
-      <w:proofErr w:type="gramEnd"/>
-      <w:r>
-        <w:t xml:space="preserve"> - 15</w:t>
-      </w:r>
-      <w:proofErr w:type="gramStart"/>
-      <w:r>
-        <w:t>% .</w:t>
-      </w:r>
-      <w:proofErr w:type="gramEnd"/>
-      <w:r>
-        <w:t xml:space="preserve"> Will take 10% for nose landing gear.</w:t>
+        <w:t>Nose gear should 5% - 15% . Will take 10% for nose landing gear.</w:t>
       </w:r>
     </w:p>
     <w:p>
@@ -820,13 +788,7 @@
         <w:br/>
       </w:r>
       <w:r>
-        <w:t xml:space="preserve">For your aircraft (MTOW ≈ 1,097,522 </w:t>
-      </w:r>
-      <w:r>
-        <w:t>lbs.</w:t>
-      </w:r>
-      <w:r>
-        <w:t xml:space="preserve">, 90% main load ≈ 987,770 </w:t>
+        <w:t xml:space="preserve">For your aircraft (MTOW ≈ 1,097,522 lbs., 90% main load ≈ 987,770 </w:t>
       </w:r>
       <w:proofErr w:type="spellStart"/>
       <w:r>
@@ -1238,13 +1200,7 @@
         </w:tabs>
       </w:pPr>
       <w:r>
-        <w:t xml:space="preserve">Tail strike </w:t>
-      </w:r>
-      <w:r>
-        <w:t>angles protect</w:t>
-      </w:r>
-      <w:r>
-        <w:t xml:space="preserve"> the fuselage during rotation.</w:t>
+        <w:t>Tail strike angles protect the fuselage during rotation.</w:t>
       </w:r>
     </w:p>
     <w:p>
@@ -1506,9 +1462,9 @@
             <m:t>=3.15m</m:t>
           </m:r>
           <m:r>
-            <w:rPr>
-              <w:i/>
-            </w:rPr>
+            <m:rPr>
+              <m:sty m:val="p"/>
+            </m:rPr>
             <w:br/>
           </m:r>
         </m:oMath>
@@ -1564,13 +1520,7 @@
             <w:rPr>
               <w:rFonts w:ascii="Cambria Math" w:hAnsi="Cambria Math"/>
             </w:rPr>
-            <m:t>=3.15+3.</m:t>
-          </m:r>
-          <m:r>
-            <w:rPr>
-              <w:rFonts w:ascii="Cambria Math" w:hAnsi="Cambria Math"/>
-            </w:rPr>
-            <m:t>9</m:t>
+            <m:t>=3.15+3.9</m:t>
           </m:r>
         </m:oMath>
       </m:oMathPara>
@@ -1621,24 +1571,12 @@
             <w:rPr>
               <w:rFonts w:ascii="Cambria Math" w:hAnsi="Cambria Math"/>
             </w:rPr>
-            <m:t>=</m:t>
+            <m:t>=7.05m</m:t>
           </m:r>
           <m:r>
-            <w:rPr>
-              <w:rFonts w:ascii="Cambria Math" w:hAnsi="Cambria Math"/>
-            </w:rPr>
-            <m:t>7.05</m:t>
-          </m:r>
-          <m:r>
-            <w:rPr>
-              <w:rFonts w:ascii="Cambria Math" w:hAnsi="Cambria Math"/>
-            </w:rPr>
-            <m:t>m</m:t>
-          </m:r>
-          <m:r>
-            <w:rPr>
-              <w:i/>
-            </w:rPr>
+            <m:rPr>
+              <m:sty m:val="p"/>
+            </m:rPr>
             <w:br/>
           </m:r>
         </m:oMath>
@@ -1793,13 +1731,7 @@
               <w:rPr>
                 <w:rFonts w:ascii="Cambria Math" w:eastAsiaTheme="minorEastAsia" w:hAnsi="Cambria Math"/>
               </w:rPr>
-              <m:t>4</m:t>
-            </m:r>
-            <m:r>
-              <w:rPr>
-                <w:rFonts w:ascii="Cambria Math" w:eastAsiaTheme="minorEastAsia" w:hAnsi="Cambria Math"/>
-              </w:rPr>
-              <m:t>9.2</m:t>
+              <m:t>49.2</m:t>
             </m:r>
           </m:e>
           <m:sup>
@@ -1931,12 +1863,20 @@
             </m:sup>
           </m:sSup>
           <m:r>
+            <m:rPr>
+              <m:sty m:val="p"/>
+            </m:rPr>
             <w:rPr>
               <w:rFonts w:eastAsiaTheme="minorEastAsia"/>
             </w:rPr>
             <w:br/>
           </m:r>
+        </m:oMath>
+        <m:oMath>
           <m:r>
+            <m:rPr>
+              <m:sty m:val="p"/>
+            </m:rPr>
             <w:rPr>
               <w:rFonts w:eastAsiaTheme="minorEastAsia"/>
             </w:rPr>
@@ -2106,6 +2046,9 @@
             </m:sup>
           </m:sSup>
           <m:r>
+            <m:rPr>
+              <m:sty m:val="p"/>
+            </m:rPr>
             <w:rPr>
               <w:rFonts w:eastAsiaTheme="minorEastAsia"/>
             </w:rPr>
@@ -2163,9 +2106,11 @@
             <m:t>=3.15m</m:t>
           </m:r>
           <m:r>
+            <m:rPr>
+              <m:sty m:val="p"/>
+            </m:rPr>
             <w:rPr>
               <w:rFonts w:eastAsiaTheme="minorEastAsia"/>
-              <w:i/>
             </w:rPr>
             <w:br/>
           </m:r>
@@ -2288,6 +2233,9 @@
             </m:den>
           </m:f>
           <m:r>
+            <m:rPr>
+              <m:sty m:val="p"/>
+            </m:rPr>
             <w:rPr>
               <w:rFonts w:eastAsiaTheme="minorEastAsia"/>
             </w:rPr>
@@ -2352,6 +2300,9 @@
             </m:den>
           </m:f>
           <m:r>
+            <m:rPr>
+              <m:sty m:val="p"/>
+            </m:rPr>
             <w:rPr>
               <w:rFonts w:eastAsiaTheme="minorEastAsia"/>
             </w:rPr>
@@ -2391,9 +2342,11 @@
             <m:t>=11.75m</m:t>
           </m:r>
           <m:r>
+            <m:rPr>
+              <m:sty m:val="p"/>
+            </m:rPr>
             <w:rPr>
               <w:rFonts w:eastAsiaTheme="minorEastAsia"/>
-              <w:i/>
             </w:rPr>
             <w:br/>
           </m:r>
@@ -2462,33 +2415,44 @@
             <m:t>CG</m:t>
           </m:r>
           <m:r>
+            <m:rPr>
+              <m:sty m:val="p"/>
+            </m:rPr>
             <w:rPr>
               <w:rFonts w:eastAsiaTheme="minorEastAsia"/>
-              <w:i/>
             </w:rPr>
             <w:br/>
           </m:r>
+        </m:oMath>
+        <m:oMath>
           <m:r>
+            <m:rPr>
+              <m:sty m:val="p"/>
+            </m:rPr>
             <w:rPr>
               <w:rFonts w:eastAsiaTheme="minorEastAsia"/>
-              <w:b/>
-              <w:bCs/>
             </w:rPr>
             <w:br/>
           </m:r>
+        </m:oMath>
+        <m:oMath>
           <m:r>
+            <m:rPr>
+              <m:sty m:val="p"/>
+            </m:rPr>
             <w:rPr>
               <w:rFonts w:eastAsiaTheme="minorEastAsia"/>
-              <w:b/>
-              <w:bCs/>
             </w:rPr>
             <w:br/>
           </m:r>
+        </m:oMath>
+        <m:oMath>
           <m:r>
+            <m:rPr>
+              <m:sty m:val="p"/>
+            </m:rPr>
             <w:rPr>
               <w:rFonts w:eastAsiaTheme="minorEastAsia"/>
-              <w:b/>
-              <w:bCs/>
             </w:rPr>
             <w:br/>
           </m:r>
@@ -3621,6 +3585,7 @@
   <w:style w:type="character" w:default="1" w:styleId="DefaultParagraphFont">
     <w:name w:val="Default Paragraph Font"/>
     <w:uiPriority w:val="1"/>
+    <w:semiHidden/>
     <w:unhideWhenUsed/>
   </w:style>
   <w:style w:type="table" w:default="1" w:styleId="TableNormal">
@@ -4253,10 +4218,18 @@
 </file>
 
 <file path=customXml/item1.xml><?xml version="1.0" encoding="utf-8"?>
+<p:properties xmlns:p="http://schemas.microsoft.com/office/2006/metadata/properties" xmlns:xsi="http://www.w3.org/2001/XMLSchema-instance" xmlns:pc="http://schemas.microsoft.com/office/infopath/2007/PartnerControls">
+  <documentManagement>
+    <_activity xmlns="136cf3f0-c616-461c-8b39-dcd1742bcc24" xsi:nil="true"/>
+  </documentManagement>
+</p:properties>
+</file>
+
+<file path=customXml/item2.xml><?xml version="1.0" encoding="utf-8"?>
 <b:Sources xmlns:b="http://schemas.openxmlformats.org/officeDocument/2006/bibliography" xmlns="http://schemas.openxmlformats.org/officeDocument/2006/bibliography" SelectedStyle="\APASixthEditionOfficeOnline.xsl" StyleName="APA" Version="6"/>
 </file>
 
-<file path=customXml/item2.xml><?xml version="1.0" encoding="utf-8"?>
+<file path=customXml/item3.xml><?xml version="1.0" encoding="utf-8"?>
 <ct:contentTypeSchema xmlns:ct="http://schemas.microsoft.com/office/2006/metadata/contentType" xmlns:ma="http://schemas.microsoft.com/office/2006/metadata/properties/metaAttributes" ct:_="" ma:_="" ma:contentTypeName="Document" ma:contentTypeID="0x010100E6EFD4250C68184E9CDBE48F2797A557" ma:contentTypeVersion="5" ma:contentTypeDescription="Create a new document." ma:contentTypeScope="" ma:versionID="81cd30060d5f19ad2ac1b5de9fdfb1ad">
   <xsd:schema xmlns:xsd="http://www.w3.org/2001/XMLSchema" xmlns:xs="http://www.w3.org/2001/XMLSchema" xmlns:p="http://schemas.microsoft.com/office/2006/metadata/properties" xmlns:ns3="136cf3f0-c616-461c-8b39-dcd1742bcc24" targetNamespace="http://schemas.microsoft.com/office/2006/metadata/properties" ma:root="true" ma:fieldsID="0707a68d80b685fc9d88510d5f951233" ns3:_="">
     <xsd:import namespace="136cf3f0-c616-461c-8b39-dcd1742bcc24"/>
@@ -4406,7 +4379,7 @@
 </ct:contentTypeSchema>
 </file>
 
-<file path=customXml/item3.xml><?xml version="1.0" encoding="utf-8"?>
+<file path=customXml/item4.xml><?xml version="1.0" encoding="utf-8"?>
 <?mso-contentType ?>
 <FormTemplates xmlns="http://schemas.microsoft.com/sharepoint/v3/contenttype/forms">
   <Display>DocumentLibraryForm</Display>
@@ -4415,15 +4388,17 @@
 </FormTemplates>
 </file>
 
-<file path=customXml/item4.xml><?xml version="1.0" encoding="utf-8"?>
-<p:properties xmlns:p="http://schemas.microsoft.com/office/2006/metadata/properties" xmlns:xsi="http://www.w3.org/2001/XMLSchema-instance" xmlns:pc="http://schemas.microsoft.com/office/infopath/2007/PartnerControls">
-  <documentManagement>
-    <_activity xmlns="136cf3f0-c616-461c-8b39-dcd1742bcc24" xsi:nil="true"/>
-  </documentManagement>
-</p:properties>
+<file path=customXml/itemProps1.xml><?xml version="1.0" encoding="utf-8"?>
+<ds:datastoreItem xmlns:ds="http://schemas.openxmlformats.org/officeDocument/2006/customXml" ds:itemID="{E331E825-37AE-4C8C-964C-C1B51AE9B701}">
+  <ds:schemaRefs>
+    <ds:schemaRef ds:uri="http://schemas.microsoft.com/office/2006/metadata/properties"/>
+    <ds:schemaRef ds:uri="http://schemas.microsoft.com/office/infopath/2007/PartnerControls"/>
+    <ds:schemaRef ds:uri="136cf3f0-c616-461c-8b39-dcd1742bcc24"/>
+  </ds:schemaRefs>
+</ds:datastoreItem>
 </file>
 
-<file path=customXml/itemProps1.xml><?xml version="1.0" encoding="utf-8"?>
+<file path=customXml/itemProps2.xml><?xml version="1.0" encoding="utf-8"?>
 <ds:datastoreItem xmlns:ds="http://schemas.openxmlformats.org/officeDocument/2006/customXml" ds:itemID="{B6C7806C-346A-4653-813B-845711A9DD33}">
   <ds:schemaRefs>
     <ds:schemaRef ds:uri="http://schemas.openxmlformats.org/officeDocument/2006/bibliography"/>
@@ -4431,7 +4406,7 @@
 </ds:datastoreItem>
 </file>
 
-<file path=customXml/itemProps2.xml><?xml version="1.0" encoding="utf-8"?>
+<file path=customXml/itemProps3.xml><?xml version="1.0" encoding="utf-8"?>
 <ds:datastoreItem xmlns:ds="http://schemas.openxmlformats.org/officeDocument/2006/customXml" ds:itemID="{B213E415-3BB5-4FC5-8C62-18236EC28809}">
   <ds:schemaRefs>
     <ds:schemaRef ds:uri="http://schemas.microsoft.com/office/2006/metadata/contentType"/>
@@ -4449,26 +4424,10 @@
 </ds:datastoreItem>
 </file>
 
-<file path=customXml/itemProps3.xml><?xml version="1.0" encoding="utf-8"?>
+<file path=customXml/itemProps4.xml><?xml version="1.0" encoding="utf-8"?>
 <ds:datastoreItem xmlns:ds="http://schemas.openxmlformats.org/officeDocument/2006/customXml" ds:itemID="{DC2A0147-8596-4F59-94DC-73A58ADC8B21}">
   <ds:schemaRefs>
     <ds:schemaRef ds:uri="http://schemas.microsoft.com/sharepoint/v3/contenttype/forms"/>
   </ds:schemaRefs>
 </ds:datastoreItem>
-</file>
-
-<file path=customXml/itemProps4.xml><?xml version="1.0" encoding="utf-8"?>
-<ds:datastoreItem xmlns:ds="http://schemas.openxmlformats.org/officeDocument/2006/customXml" ds:itemID="{E331E825-37AE-4C8C-964C-C1B51AE9B701}">
-  <ds:schemaRefs>
-    <ds:schemaRef ds:uri="http://schemas.microsoft.com/office/2006/documentManagement/types"/>
-    <ds:schemaRef ds:uri="136cf3f0-c616-461c-8b39-dcd1742bcc24"/>
-    <ds:schemaRef ds:uri="http://purl.org/dc/terms/"/>
-    <ds:schemaRef ds:uri="http://schemas.microsoft.com/office/2006/metadata/properties"/>
-    <ds:schemaRef ds:uri="http://www.w3.org/XML/1998/namespace"/>
-    <ds:schemaRef ds:uri="http://purl.org/dc/elements/1.1/"/>
-    <ds:schemaRef ds:uri="http://schemas.microsoft.com/office/infopath/2007/PartnerControls"/>
-    <ds:schemaRef ds:uri="http://schemas.openxmlformats.org/package/2006/metadata/core-properties"/>
-    <ds:schemaRef ds:uri="http://purl.org/dc/dcmitype/"/>
-  </ds:schemaRefs>
-</ds:datastoreItem>
 </file>
</xml_diff>